<commit_message>
1AS unit 1 lesson plans rewritten in the usual teachers' style, 11 sessions of 2 h with textbook page references
Co-Authored-By: Claude Opus 5.5 <noreply@anthropic.com>
Claude-Session: https://claude.ai/code/session_015WVgZKTbSWpZTjn6aZsqC9
</commit_message>
<xml_diff>
--- a/documents/1as/modhakirat/modhakira_wahda1_1as.docx
+++ b/documents/1as/modhakirat/modhakira_wahda1_1as.docx
@@ -38,7 +38,7 @@
                 <w:szCs w:val="52"/>
                 <w:rtl/>
               </w:rPr>
-              <w:t xml:space="preserve">المذكرة الشاملة: محور الأعداد والحساب</w:t>
+              <w:t xml:space="preserve">مذكرات محور: الأعداد والحساب</w:t>
             </w:r>
           </w:p>
           <w:p>
@@ -70,7 +70,7 @@
                 <w:szCs w:val="30"/>
                 <w:rtl/>
               </w:rPr>
-              <w:t xml:space="preserve">12 حصة مطابقة للتوزيع السنوي 2026-2027</w:t>
+              <w:t xml:space="preserve">11 مذكرة (22 ساعة) – السنة الدراسية 2026-2027</w:t>
             </w:r>
           </w:p>
         </w:tc>
@@ -126,7 +126,7 @@
                 <w:color w:val="FFFFFF"/>
                 <w:rtl/>
               </w:rPr>
-              <w:t xml:space="preserve">محتوى المذكرة</w:t>
+              <w:t xml:space="preserve">يتضمن هذا العمل</w:t>
             </w:r>
           </w:p>
         </w:tc>
@@ -278,13 +278,7 @@
               <w:rPr>
                 <w:rtl/>
               </w:rPr>
-              <w:t xml:space="preserve"> </w:t>
-            </w:r>
-            <w:r>
-              <w:rPr>
-                <w:rtl/>
-              </w:rPr>
-              <w:t xml:space="preserve">(1 سا)</w:t>
+              <w:t xml:space="preserve">.</w:t>
             </w:r>
           </w:p>
           <w:p>
@@ -299,7 +293,7 @@
               <w:rPr>
                 <w:rtl/>
               </w:rPr>
-              <w:t xml:space="preserve">الأعداد الأولية وتحليل عدد إلى جداء عوامل أولية (1 سا)</w:t>
+              <w:t xml:space="preserve">الأعداد الأولية وتحليل عدد طبيعي إلى جداء عوامل أولية.</w:t>
             </w:r>
           </w:p>
           <w:p>
@@ -345,7 +339,7 @@
               <w:rPr>
                 <w:rtl/>
               </w:rPr>
-              <w:t xml:space="preserve">عدد أصم ، والأعداد القابلة للإنشاء (1 سا)</w:t>
+              <w:t xml:space="preserve">عدد أصم ، والأعداد القابلة للإنشاء.</w:t>
             </w:r>
           </w:p>
           <w:p>
@@ -360,7 +354,7 @@
               <w:rPr>
                 <w:rtl/>
               </w:rPr>
-              <w:t xml:space="preserve">الحساب على الكسور والقوى الصحيحة (1 سا)</w:t>
+              <w:t xml:space="preserve">الحساب على الكسور والقوى الصحيحة ، الكتابة العلمية ورتبة المقدار.</w:t>
             </w:r>
           </w:p>
           <w:p>
@@ -375,7 +369,7 @@
               <w:rPr>
                 <w:rtl/>
               </w:rPr>
-              <w:t xml:space="preserve">الجذور التربيعية (1 سا)</w:t>
+              <w:t xml:space="preserve">الجذور التربيعية والحساب المضبوط.</w:t>
             </w:r>
           </w:p>
           <w:p>
@@ -390,7 +384,7 @@
               <w:rPr>
                 <w:rtl/>
               </w:rPr>
-              <w:t xml:space="preserve">الكتابة العشرية والعلمية ، رتبة مقدار ، التدوير والحاسبة (2 سا)</w:t>
+              <w:t xml:space="preserve">القيم المقربة ، التدوير والحاسبة العلمية.</w:t>
             </w:r>
           </w:p>
           <w:p>
@@ -426,13 +420,7 @@
               <w:rPr>
                 <w:rtl/>
               </w:rPr>
-              <w:t xml:space="preserve"> </w:t>
-            </w:r>
-            <w:r>
-              <w:rPr>
-                <w:rtl/>
-              </w:rPr>
-              <w:t xml:space="preserve">(1 سا)</w:t>
+              <w:t xml:space="preserve">.</w:t>
             </w:r>
           </w:p>
           <w:p>
@@ -447,7 +435,7 @@
               <w:rPr>
                 <w:rtl/>
               </w:rPr>
-              <w:t xml:space="preserve">الحصر والقيم المقربة (2 سا)</w:t>
+              <w:t xml:space="preserve">الحصر والقيم المقربة.</w:t>
             </w:r>
           </w:p>
           <w:p>
@@ -462,7 +450,7 @@
               <w:rPr>
                 <w:rtl/>
               </w:rPr>
-              <w:t xml:space="preserve">المجالات: التقاطع والاتحاد (1 سا)</w:t>
+              <w:t xml:space="preserve">المجالات: التمثيل ، التقاطع والاتحاد.</w:t>
             </w:r>
           </w:p>
           <w:p>
@@ -477,7 +465,7 @@
               <w:rPr>
                 <w:rtl/>
               </w:rPr>
-              <w:t xml:space="preserve">القيمة المطلقة والمسافة (1 سا)</w:t>
+              <w:t xml:space="preserve">القيمة المطلقة والمسافة.</w:t>
             </w:r>
           </w:p>
           <w:p>
@@ -492,22 +480,18 @@
               <w:rPr>
                 <w:rtl/>
               </w:rPr>
-              <w:t xml:space="preserve">معادلات ومتراجحات بقيمة مطلقة ، البرهان بفصل الحالات (1 سا)</w:t>
+              <w:t xml:space="preserve">معادلات ومتراجحات بقيمة مطلقة ، البرهان بفصل الحالات ، إشارة ثنائي حد.</w:t>
             </w:r>
           </w:p>
           <w:p>
             <w:pPr>
-              <w:numPr>
-                <w:ilvl w:val="0"/>
-                <w:numId w:val="1001"/>
-              </w:numPr>
               <w:bidi/>
             </w:pPr>
             <w:r>
               <w:rPr>
                 <w:rtl/>
               </w:rPr>
-              <w:t xml:space="preserve">إشارة ثنائي حد من الدرجة الأولى (1 سا)</w:t>
+              <w:t xml:space="preserve">مراجع النشاطات: الكتاب المدرسي للسنة الأولى ثانوي جذع مشترك علوم وتكنولوجيا (الباب 1 ص 2–3 ، الباب 2 ص 25).</w:t>
             </w:r>
           </w:p>
         </w:tc>
@@ -542,7 +526,7 @@
         <w:rPr>
           <w:rtl/>
         </w:rPr>
-        <w:t xml:space="preserve">الأعداد الطبيعية والأعداد النسبية (التعليم المتوسط).</w:t>
+        <w:t xml:space="preserve">الأعداد الطبيعية والأعداد النسبية.</w:t>
       </w:r>
     </w:p>
     <w:p>
@@ -689,91 +673,18 @@
         <w:rPr>
           <w:rtl/>
         </w:rPr>
-        <w:t xml:space="preserve">معرفة ترتيب المجموعات</w:t>
-      </w:r>
-      <w:r>
-        <w:rPr>
-          <w:rtl/>
-        </w:rPr>
-        <w:t xml:space="preserve"> </w:t>
-      </w:r>
-      <m:oMath>
-        <m:r>
-          <m:rPr>
-            <m:sty m:val="p"/>
-            <m:scr m:val="double-struck"/>
-          </m:rPr>
-          <m:t>N</m:t>
-        </m:r>
-        <m:r>
-          <m:rPr>
-            <m:sty m:val="p"/>
-          </m:rPr>
-          <m:t>⊂</m:t>
-        </m:r>
-        <m:r>
-          <m:rPr>
-            <m:sty m:val="p"/>
-            <m:scr m:val="double-struck"/>
-          </m:rPr>
-          <m:t>Z</m:t>
-        </m:r>
-        <m:r>
-          <m:rPr>
-            <m:sty m:val="p"/>
-          </m:rPr>
-          <m:t>⊂</m:t>
-        </m:r>
-        <m:r>
-          <m:rPr>
-            <m:sty m:val="p"/>
-            <m:scr m:val="double-struck"/>
-          </m:rPr>
-          <m:t>D</m:t>
-        </m:r>
-        <m:r>
-          <m:rPr>
-            <m:sty m:val="p"/>
-          </m:rPr>
-          <m:t>⊂</m:t>
-        </m:r>
-        <m:r>
-          <m:rPr>
-            <m:sty m:val="p"/>
-            <m:scr m:val="double-struck"/>
-          </m:rPr>
-          <m:t>Q</m:t>
-        </m:r>
-        <m:r>
-          <m:rPr>
-            <m:sty m:val="p"/>
-          </m:rPr>
-          <m:t>⊂</m:t>
-        </m:r>
-        <m:r>
-          <m:rPr>
-            <m:sty m:val="p"/>
-            <m:scr m:val="double-struck"/>
-          </m:rPr>
-          <m:t>R</m:t>
-        </m:r>
-      </m:oMath>
-      <w:r>
-        <w:rPr>
-          <w:rtl/>
-        </w:rPr>
-        <w:t xml:space="preserve">.</w:t>
-      </w:r>
-    </w:p>
-    <w:p>
-      <w:pPr>
-        <w:bidi/>
-      </w:pPr>
-      <w:r>
-        <w:rPr>
-          <w:rtl/>
-        </w:rPr>
-        <w:t xml:space="preserve">الكتاب المدرسي (باب «الأعداد والحساب»: نشاط 1) ، السبورة ، الحاسبة.</w:t>
+        <w:t xml:space="preserve">معرفة متى يكون عدد ناطق عدداً عشرياً.</w:t>
+      </w:r>
+    </w:p>
+    <w:p>
+      <w:pPr>
+        <w:bidi/>
+      </w:pPr>
+      <w:r>
+        <w:rPr>
+          <w:rtl/>
+        </w:rPr>
+        <w:t xml:space="preserve">المنهاج ، الكتاب المدرسي ، مراجع ، الحاسبة.</w:t>
       </w:r>
     </w:p>
     <w:p>
@@ -941,7 +852,7 @@
         <w:rPr>
           <w:rtl/>
         </w:rPr>
-        <w:t xml:space="preserve">الكتاب المدرسي (باب «الأعداد والحساب»: نشاط 6) ، السبورة.</w:t>
+        <w:t xml:space="preserve">المنهاج ، الكتاب المدرسي ، مراجع ، الحاسبة.</w:t>
       </w:r>
     </w:p>
     <w:p>
@@ -967,7 +878,7 @@
         <w:rPr>
           <w:rtl/>
         </w:rPr>
-        <w:t xml:space="preserve">مبرهنة فيثاغورس ومبرهنة طالس.</w:t>
+        <w:t xml:space="preserve">مبرهنتا فيثاغورس وطالس.</w:t>
       </w:r>
     </w:p>
     <w:p>
@@ -997,6 +908,21 @@
         <w:rPr>
           <w:rtl/>
         </w:rPr>
+        <w:t xml:space="preserve">التمييز بين الأعداد الناطقة والصماء.</w:t>
+      </w:r>
+    </w:p>
+    <w:p>
+      <w:pPr>
+        <w:numPr>
+          <w:ilvl w:val="0"/>
+          <w:numId w:val="1007"/>
+        </w:numPr>
+        <w:bidi/>
+      </w:pPr>
+      <w:r>
+        <w:rPr>
+          <w:rtl/>
+        </w:rPr>
         <w:t xml:space="preserve">البرهان بالخلف.</w:t>
       </w:r>
     </w:p>
@@ -1023,7 +949,7 @@
         <w:rPr>
           <w:rtl/>
         </w:rPr>
-        <w:t xml:space="preserve">الكتاب المدرسي (نشاطا 2 و 3: أعداد قابلة للإنشاء) ، أدوات الهندسة.</w:t>
+        <w:t xml:space="preserve">المنهاج ، الكتاب المدرسي ، أدوات الهندسة.</w:t>
       </w:r>
     </w:p>
     <w:p>
@@ -1049,7 +975,7 @@
         <w:rPr>
           <w:rtl/>
         </w:rPr>
-        <w:t xml:space="preserve">العمليات على الكسور (التعليم المتوسط).</w:t>
+        <w:t xml:space="preserve">العمليات على الكسور.</w:t>
       </w:r>
     </w:p>
     <w:p>
@@ -1079,141 +1005,22 @@
         <w:rPr>
           <w:rtl/>
         </w:rPr>
-        <w:t xml:space="preserve">التحكم في الحساب على الكسور والقوى الصحيحة والدمج بينها.</w:t>
-      </w:r>
-    </w:p>
-    <w:p>
-      <w:pPr>
-        <w:bidi/>
-      </w:pPr>
-      <w:r>
-        <w:rPr>
-          <w:rtl/>
-        </w:rPr>
-        <w:t xml:space="preserve">الكتاب المدرسي ، السبورة.</w:t>
-      </w:r>
-    </w:p>
-    <w:p>
-      <w:pPr>
-        <w:bidi/>
-      </w:pPr>
-      <w:r>
-        <w:rPr>
-          <w:rtl/>
-        </w:rPr>
-        <w:br w:type="page"/>
-      </w:r>
-    </w:p>
-    <w:p>
-      <w:pPr>
-        <w:numPr>
-          <w:ilvl w:val="0"/>
-          <w:numId w:val="1010"/>
-        </w:numPr>
-        <w:bidi/>
-      </w:pPr>
-      <w:r>
-        <w:rPr>
-          <w:rtl/>
-        </w:rPr>
-        <w:t xml:space="preserve">تعريف الجذر التربيعي لعدد موجب.</w:t>
-      </w:r>
-    </w:p>
-    <w:p>
-      <w:pPr>
-        <w:numPr>
-          <w:ilvl w:val="0"/>
-          <w:numId w:val="1010"/>
-        </w:numPr>
-        <w:bidi/>
-      </w:pPr>
-      <w:r>
-        <w:rPr>
-          <w:rtl/>
-        </w:rPr>
-        <w:t xml:space="preserve">المتطابقات الشهيرة.</w:t>
-      </w:r>
-    </w:p>
-    <w:p>
-      <w:pPr>
-        <w:numPr>
-          <w:ilvl w:val="0"/>
-          <w:numId w:val="1011"/>
-        </w:numPr>
-        <w:bidi/>
-      </w:pPr>
-      <w:r>
-        <w:rPr>
-          <w:rtl/>
-        </w:rPr>
-        <w:t xml:space="preserve">التحكم في الحساب على الجذور التربيعية.</w:t>
-      </w:r>
-    </w:p>
-    <w:p>
-      <w:pPr>
-        <w:numPr>
-          <w:ilvl w:val="0"/>
-          <w:numId w:val="1011"/>
-        </w:numPr>
-        <w:bidi/>
-      </w:pPr>
-      <w:r>
-        <w:rPr>
-          <w:rtl/>
-        </w:rPr>
-        <w:t xml:space="preserve">التمييز بين القيمة المضبوطة والقيمة المقربة.</w:t>
-      </w:r>
-    </w:p>
-    <w:p>
-      <w:pPr>
-        <w:bidi/>
-      </w:pPr>
-      <w:r>
-        <w:rPr>
-          <w:rtl/>
-        </w:rPr>
-        <w:t xml:space="preserve">الكتاب المدرسي (نشاط 4: ضرورة استعمال الحساب المضبوط) ، الحاسبة.</w:t>
-      </w:r>
-    </w:p>
-    <w:p>
-      <w:pPr>
-        <w:bidi/>
-      </w:pPr>
-      <w:r>
-        <w:rPr>
-          <w:rtl/>
-        </w:rPr>
-        <w:br w:type="page"/>
-      </w:r>
-    </w:p>
-    <w:p>
-      <w:pPr>
-        <w:numPr>
-          <w:ilvl w:val="0"/>
-          <w:numId w:val="1012"/>
-        </w:numPr>
-        <w:bidi/>
-      </w:pPr>
-      <w:r>
-        <w:rPr>
-          <w:rtl/>
-        </w:rPr>
-        <w:t xml:space="preserve">الكسور والأعداد العشرية.</w:t>
-      </w:r>
-    </w:p>
-    <w:p>
-      <w:pPr>
-        <w:numPr>
-          <w:ilvl w:val="0"/>
-          <w:numId w:val="1012"/>
-        </w:numPr>
-        <w:bidi/>
-      </w:pPr>
-      <w:r>
-        <w:rPr>
-          <w:rtl/>
-        </w:rPr>
-        <w:t xml:space="preserve">القوى الصحيحة للعدد</w:t>
+        <w:t xml:space="preserve">التحكم في الحساب على الكسور والقوى الصحيحة.</w:t>
+      </w:r>
+    </w:p>
+    <w:p>
+      <w:pPr>
+        <w:numPr>
+          <w:ilvl w:val="0"/>
+          <w:numId w:val="1009"/>
+        </w:numPr>
+        <w:bidi/>
+      </w:pPr>
+      <w:r>
+        <w:rPr>
+          <w:rtl/>
+        </w:rPr>
+        <w:t xml:space="preserve">الكتابة العلمية والقوى الصحيحة للعدد</w:t>
       </w:r>
       <w:r>
         <w:rPr>
@@ -1237,6 +1044,155 @@
       <w:pPr>
         <w:numPr>
           <w:ilvl w:val="0"/>
+          <w:numId w:val="1009"/>
+        </w:numPr>
+        <w:bidi/>
+      </w:pPr>
+      <w:r>
+        <w:rPr>
+          <w:rtl/>
+        </w:rPr>
+        <w:t xml:space="preserve">تحديد رتبة مقدار عدد.</w:t>
+      </w:r>
+    </w:p>
+    <w:p>
+      <w:pPr>
+        <w:bidi/>
+      </w:pPr>
+      <w:r>
+        <w:rPr>
+          <w:rtl/>
+        </w:rPr>
+        <w:t xml:space="preserve">المنهاج ، الكتاب المدرسي ، مراجع ، الحاسبة.</w:t>
+      </w:r>
+    </w:p>
+    <w:p>
+      <w:pPr>
+        <w:bidi/>
+      </w:pPr>
+      <w:r>
+        <w:rPr>
+          <w:rtl/>
+        </w:rPr>
+        <w:br w:type="page"/>
+      </w:r>
+    </w:p>
+    <w:p>
+      <w:pPr>
+        <w:numPr>
+          <w:ilvl w:val="0"/>
+          <w:numId w:val="1010"/>
+        </w:numPr>
+        <w:bidi/>
+      </w:pPr>
+      <w:r>
+        <w:rPr>
+          <w:rtl/>
+        </w:rPr>
+        <w:t xml:space="preserve">تعريف الجذر التربيعي لعدد موجب.</w:t>
+      </w:r>
+    </w:p>
+    <w:p>
+      <w:pPr>
+        <w:numPr>
+          <w:ilvl w:val="0"/>
+          <w:numId w:val="1010"/>
+        </w:numPr>
+        <w:bidi/>
+      </w:pPr>
+      <w:r>
+        <w:rPr>
+          <w:rtl/>
+        </w:rPr>
+        <w:t xml:space="preserve">المتطابقات الشهيرة.</w:t>
+      </w:r>
+    </w:p>
+    <w:p>
+      <w:pPr>
+        <w:numPr>
+          <w:ilvl w:val="0"/>
+          <w:numId w:val="1011"/>
+        </w:numPr>
+        <w:bidi/>
+      </w:pPr>
+      <w:r>
+        <w:rPr>
+          <w:rtl/>
+        </w:rPr>
+        <w:t xml:space="preserve">التحكم في الحساب على الجذور التربيعية.</w:t>
+      </w:r>
+    </w:p>
+    <w:p>
+      <w:pPr>
+        <w:numPr>
+          <w:ilvl w:val="0"/>
+          <w:numId w:val="1011"/>
+        </w:numPr>
+        <w:bidi/>
+      </w:pPr>
+      <w:r>
+        <w:rPr>
+          <w:rtl/>
+        </w:rPr>
+        <w:t xml:space="preserve">التمييز بين القيمة المضبوطة والقيمة المقربة.</w:t>
+      </w:r>
+    </w:p>
+    <w:p>
+      <w:pPr>
+        <w:bidi/>
+      </w:pPr>
+      <w:r>
+        <w:rPr>
+          <w:rtl/>
+        </w:rPr>
+        <w:t xml:space="preserve">المنهاج ، الكتاب المدرسي ، مراجع ، الحاسبة.</w:t>
+      </w:r>
+    </w:p>
+    <w:p>
+      <w:pPr>
+        <w:bidi/>
+      </w:pPr>
+      <w:r>
+        <w:rPr>
+          <w:rtl/>
+        </w:rPr>
+        <w:br w:type="page"/>
+      </w:r>
+    </w:p>
+    <w:p>
+      <w:pPr>
+        <w:numPr>
+          <w:ilvl w:val="0"/>
+          <w:numId w:val="1012"/>
+        </w:numPr>
+        <w:bidi/>
+      </w:pPr>
+      <w:r>
+        <w:rPr>
+          <w:rtl/>
+        </w:rPr>
+        <w:t xml:space="preserve">الكتابة العشرية.</w:t>
+      </w:r>
+    </w:p>
+    <w:p>
+      <w:pPr>
+        <w:numPr>
+          <w:ilvl w:val="0"/>
+          <w:numId w:val="1012"/>
+        </w:numPr>
+        <w:bidi/>
+      </w:pPr>
+      <w:r>
+        <w:rPr>
+          <w:rtl/>
+        </w:rPr>
+        <w:t xml:space="preserve">الكتابة العلمية.</w:t>
+      </w:r>
+    </w:p>
+    <w:p>
+      <w:pPr>
+        <w:numPr>
+          <w:ilvl w:val="0"/>
           <w:numId w:val="1013"/>
         </w:numPr>
         <w:bidi/>
@@ -1245,7 +1201,39 @@
         <w:rPr>
           <w:rtl/>
         </w:rPr>
-        <w:t xml:space="preserve">التحويل من وإلى الكتابة العشرية.</w:t>
+        <w:t xml:space="preserve">تدوير عدد عشري إلى</w:t>
+      </w:r>
+      <w:r>
+        <w:rPr>
+          <w:rtl/>
+        </w:rPr>
+        <w:t xml:space="preserve"> </w:t>
+      </w:r>
+      <m:oMath>
+        <m:sSup>
+          <m:e>
+            <m:r>
+              <m:t>10</m:t>
+            </m:r>
+          </m:e>
+          <m:sup>
+            <m:r>
+              <m:rPr>
+                <m:sty m:val="p"/>
+              </m:rPr>
+              <m:t>−</m:t>
+            </m:r>
+            <m:r>
+              <m:t>p</m:t>
+            </m:r>
+          </m:sup>
+        </m:sSup>
+      </m:oMath>
+      <w:r>
+        <w:rPr>
+          <w:rtl/>
+        </w:rPr>
+        <w:t xml:space="preserve">.</w:t>
       </w:r>
     </w:p>
     <w:p>
@@ -1260,7 +1248,7 @@
         <w:rPr>
           <w:rtl/>
         </w:rPr>
-        <w:t xml:space="preserve">الكتابة العلمية ورتبة مقدار عدد.</w:t>
+        <w:t xml:space="preserve">التمييز بين عدد وإحدى قيمه المقربة.</w:t>
       </w:r>
     </w:p>
     <w:p>
@@ -1275,33 +1263,18 @@
         <w:rPr>
           <w:rtl/>
         </w:rPr>
-        <w:t xml:space="preserve">تدوير عدد عشري ، والتمييز بين عدد وقيمة مقربة له.</w:t>
-      </w:r>
-    </w:p>
-    <w:p>
-      <w:pPr>
-        <w:numPr>
-          <w:ilvl w:val="0"/>
-          <w:numId w:val="1013"/>
-        </w:numPr>
-        <w:bidi/>
-      </w:pPr>
-      <w:r>
-        <w:rPr>
-          <w:rtl/>
-        </w:rPr>
-        <w:t xml:space="preserve">استعمال الحاسبة العلمية.</w:t>
-      </w:r>
-    </w:p>
-    <w:p>
-      <w:pPr>
-        <w:bidi/>
-      </w:pPr>
-      <w:r>
-        <w:rPr>
-          <w:rtl/>
-        </w:rPr>
-        <w:t xml:space="preserve">الكتاب المدرسي (نشاط 5: الخاصية المميزة للعدد العشري) ، الحاسبة العلمية.</w:t>
+        <w:t xml:space="preserve">استخدام الحاسبة العلمية لتنظيم وإجراء حساب.</w:t>
+      </w:r>
+    </w:p>
+    <w:p>
+      <w:pPr>
+        <w:bidi/>
+      </w:pPr>
+      <w:r>
+        <w:rPr>
+          <w:rtl/>
+        </w:rPr>
+        <w:t xml:space="preserve">المنهاج ، الكتاب المدرسي ، مراجع ، الحاسبة.</w:t>
       </w:r>
     </w:p>
     <w:p>
@@ -1383,7 +1356,145 @@
         <w:rPr>
           <w:rtl/>
         </w:rPr>
-        <w:t xml:space="preserve">الكتاب المدرسي (باب «الترتيب في</w:t>
+        <w:t xml:space="preserve">المنهاج ، الكتاب المدرسي ، مراجع ، الحاسبة.</w:t>
+      </w:r>
+    </w:p>
+    <w:p>
+      <w:pPr>
+        <w:bidi/>
+      </w:pPr>
+      <w:r>
+        <w:rPr>
+          <w:rtl/>
+        </w:rPr>
+        <w:br w:type="page"/>
+      </w:r>
+    </w:p>
+    <w:p>
+      <w:pPr>
+        <w:numPr>
+          <w:ilvl w:val="0"/>
+          <w:numId w:val="1016"/>
+        </w:numPr>
+        <w:bidi/>
+      </w:pPr>
+      <w:r>
+        <w:rPr>
+          <w:rtl/>
+        </w:rPr>
+        <w:t xml:space="preserve">خواص الترتيب والعمليات.</w:t>
+      </w:r>
+    </w:p>
+    <w:p>
+      <w:pPr>
+        <w:numPr>
+          <w:ilvl w:val="0"/>
+          <w:numId w:val="1016"/>
+        </w:numPr>
+        <w:bidi/>
+      </w:pPr>
+      <w:r>
+        <w:rPr>
+          <w:rtl/>
+        </w:rPr>
+        <w:t xml:space="preserve">التدوير.</w:t>
+      </w:r>
+    </w:p>
+    <w:p>
+      <w:pPr>
+        <w:numPr>
+          <w:ilvl w:val="0"/>
+          <w:numId w:val="1017"/>
+        </w:numPr>
+        <w:bidi/>
+      </w:pPr>
+      <w:r>
+        <w:rPr>
+          <w:rtl/>
+        </w:rPr>
+        <w:t xml:space="preserve">حصر عدد حقيقي.</w:t>
+      </w:r>
+    </w:p>
+    <w:p>
+      <w:pPr>
+        <w:numPr>
+          <w:ilvl w:val="0"/>
+          <w:numId w:val="1017"/>
+        </w:numPr>
+        <w:bidi/>
+      </w:pPr>
+      <w:r>
+        <w:rPr>
+          <w:rtl/>
+        </w:rPr>
+        <w:t xml:space="preserve">حصر مجموع وفرق وجداء ومقلوب ونسبة.</w:t>
+      </w:r>
+    </w:p>
+    <w:p>
+      <w:pPr>
+        <w:numPr>
+          <w:ilvl w:val="0"/>
+          <w:numId w:val="1017"/>
+        </w:numPr>
+        <w:bidi/>
+      </w:pPr>
+      <w:r>
+        <w:rPr>
+          <w:rtl/>
+        </w:rPr>
+        <w:t xml:space="preserve">حصر عبارة جبرية.</w:t>
+      </w:r>
+    </w:p>
+    <w:p>
+      <w:pPr>
+        <w:bidi/>
+      </w:pPr>
+      <w:r>
+        <w:rPr>
+          <w:rtl/>
+        </w:rPr>
+        <w:t xml:space="preserve">المنهاج ، الكتاب المدرسي ، مراجع ، الحاسبة.</w:t>
+      </w:r>
+    </w:p>
+    <w:p>
+      <w:pPr>
+        <w:bidi/>
+      </w:pPr>
+      <w:r>
+        <w:rPr>
+          <w:rtl/>
+        </w:rPr>
+        <w:br w:type="page"/>
+      </w:r>
+    </w:p>
+    <w:p>
+      <w:pPr>
+        <w:numPr>
+          <w:ilvl w:val="0"/>
+          <w:numId w:val="1018"/>
+        </w:numPr>
+        <w:bidi/>
+      </w:pPr>
+      <w:r>
+        <w:rPr>
+          <w:rtl/>
+        </w:rPr>
+        <w:t xml:space="preserve">المتباينات والمستقيم العددي.</w:t>
+      </w:r>
+    </w:p>
+    <w:p>
+      <w:pPr>
+        <w:numPr>
+          <w:ilvl w:val="0"/>
+          <w:numId w:val="1019"/>
+        </w:numPr>
+        <w:bidi/>
+      </w:pPr>
+      <w:r>
+        <w:rPr>
+          <w:rtl/>
+        </w:rPr>
+        <w:t xml:space="preserve">التعبير عن جزء متصل من</w:t>
       </w:r>
       <w:r>
         <w:rPr>
@@ -1404,7 +1515,39 @@
         <w:rPr>
           <w:rtl/>
         </w:rPr>
-        <w:t xml:space="preserve">»: النشاطان 1 و 2) ، الحاسبة.</w:t>
+        <w:t xml:space="preserve"> </w:t>
+      </w:r>
+      <w:r>
+        <w:rPr>
+          <w:rtl/>
+        </w:rPr>
+        <w:t xml:space="preserve">بمجال.</w:t>
+      </w:r>
+    </w:p>
+    <w:p>
+      <w:pPr>
+        <w:numPr>
+          <w:ilvl w:val="0"/>
+          <w:numId w:val="1019"/>
+        </w:numPr>
+        <w:bidi/>
+      </w:pPr>
+      <w:r>
+        <w:rPr>
+          <w:rtl/>
+        </w:rPr>
+        <w:t xml:space="preserve">تعيين تقاطع واتحاد مجالين.</w:t>
+      </w:r>
+    </w:p>
+    <w:p>
+      <w:pPr>
+        <w:bidi/>
+      </w:pPr>
+      <w:r>
+        <w:rPr>
+          <w:rtl/>
+        </w:rPr>
+        <w:t xml:space="preserve">المنهاج ، الكتاب المدرسي ، السبورة.</w:t>
       </w:r>
     </w:p>
     <w:p>
@@ -1422,107 +1565,56 @@
       <w:pPr>
         <w:numPr>
           <w:ilvl w:val="0"/>
-          <w:numId w:val="1016"/>
-        </w:numPr>
-        <w:bidi/>
-      </w:pPr>
-      <w:r>
-        <w:rPr>
-          <w:rtl/>
-        </w:rPr>
-        <w:t xml:space="preserve">خواص الترتيب والعمليات.</w:t>
-      </w:r>
-    </w:p>
-    <w:p>
-      <w:pPr>
-        <w:numPr>
-          <w:ilvl w:val="0"/>
-          <w:numId w:val="1016"/>
-        </w:numPr>
-        <w:bidi/>
-      </w:pPr>
-      <w:r>
-        <w:rPr>
-          <w:rtl/>
-        </w:rPr>
-        <w:t xml:space="preserve">الكتابة العشرية والتدوير.</w:t>
-      </w:r>
-    </w:p>
-    <w:p>
-      <w:pPr>
-        <w:numPr>
-          <w:ilvl w:val="0"/>
-          <w:numId w:val="1017"/>
-        </w:numPr>
-        <w:bidi/>
-      </w:pPr>
-      <w:r>
-        <w:rPr>
-          <w:rtl/>
-        </w:rPr>
-        <w:t xml:space="preserve">حصر عدد حقيقي.</w:t>
-      </w:r>
-    </w:p>
-    <w:p>
-      <w:pPr>
-        <w:numPr>
-          <w:ilvl w:val="0"/>
-          <w:numId w:val="1017"/>
-        </w:numPr>
-        <w:bidi/>
-      </w:pPr>
-      <w:r>
-        <w:rPr>
-          <w:rtl/>
-        </w:rPr>
-        <w:t xml:space="preserve">حصر مجموع وفرق وجداء ومقلوب ونسبة.</w:t>
-      </w:r>
-    </w:p>
-    <w:p>
-      <w:pPr>
-        <w:numPr>
-          <w:ilvl w:val="0"/>
-          <w:numId w:val="1017"/>
-        </w:numPr>
-        <w:bidi/>
-      </w:pPr>
-      <w:r>
-        <w:rPr>
-          <w:rtl/>
-        </w:rPr>
-        <w:t xml:space="preserve">حصر عبارة جبرية.</w:t>
-      </w:r>
-    </w:p>
-    <w:p>
-      <w:pPr>
-        <w:bidi/>
-      </w:pPr>
-      <w:r>
-        <w:rPr>
-          <w:rtl/>
-        </w:rPr>
-        <w:t xml:space="preserve">الكتاب المدرسي (باب «الترتيب في</w:t>
-      </w:r>
-      <w:r>
-        <w:rPr>
-          <w:rtl/>
-        </w:rPr>
-        <w:t xml:space="preserve"> </w:t>
-      </w:r>
-      <m:oMath>
-        <m:r>
-          <m:rPr>
-            <m:sty m:val="p"/>
-            <m:scr m:val="double-struck"/>
-          </m:rPr>
-          <m:t>R</m:t>
-        </m:r>
-      </m:oMath>
-      <w:r>
-        <w:rPr>
-          <w:rtl/>
-        </w:rPr>
-        <w:t xml:space="preserve">»: نشاط 3 الحصر) ، الحاسبة.</w:t>
+          <w:numId w:val="1020"/>
+        </w:numPr>
+        <w:bidi/>
+      </w:pPr>
+      <w:r>
+        <w:rPr>
+          <w:rtl/>
+        </w:rPr>
+        <w:t xml:space="preserve">المستقيم العددي والمجالات.</w:t>
+      </w:r>
+    </w:p>
+    <w:p>
+      <w:pPr>
+        <w:numPr>
+          <w:ilvl w:val="0"/>
+          <w:numId w:val="1021"/>
+        </w:numPr>
+        <w:bidi/>
+      </w:pPr>
+      <w:r>
+        <w:rPr>
+          <w:rtl/>
+        </w:rPr>
+        <w:t xml:space="preserve">كتابة عبارة بقيمة مطلقة دون الرمز.</w:t>
+      </w:r>
+    </w:p>
+    <w:p>
+      <w:pPr>
+        <w:numPr>
+          <w:ilvl w:val="0"/>
+          <w:numId w:val="1021"/>
+        </w:numPr>
+        <w:bidi/>
+      </w:pPr>
+      <w:r>
+        <w:rPr>
+          <w:rtl/>
+        </w:rPr>
+        <w:t xml:space="preserve">التعبير عن مجال بأربع صيغ: مجال ، حصر ، مسافة ، قيمة مطلقة.</w:t>
+      </w:r>
+    </w:p>
+    <w:p>
+      <w:pPr>
+        <w:bidi/>
+      </w:pPr>
+      <w:r>
+        <w:rPr>
+          <w:rtl/>
+        </w:rPr>
+        <w:t xml:space="preserve">المنهاج ، الكتاب المدرسي ، السبورة.</w:t>
       </w:r>
     </w:p>
     <w:p>
@@ -1540,188 +1632,6 @@
       <w:pPr>
         <w:numPr>
           <w:ilvl w:val="0"/>
-          <w:numId w:val="1018"/>
-        </w:numPr>
-        <w:bidi/>
-      </w:pPr>
-      <w:r>
-        <w:rPr>
-          <w:rtl/>
-        </w:rPr>
-        <w:t xml:space="preserve">المتباينات والمستقيم العددي.</w:t>
-      </w:r>
-    </w:p>
-    <w:p>
-      <w:pPr>
-        <w:numPr>
-          <w:ilvl w:val="0"/>
-          <w:numId w:val="1019"/>
-        </w:numPr>
-        <w:bidi/>
-      </w:pPr>
-      <w:r>
-        <w:rPr>
-          <w:rtl/>
-        </w:rPr>
-        <w:t xml:space="preserve">التعبير عن جزء متصل من</w:t>
-      </w:r>
-      <w:r>
-        <w:rPr>
-          <w:rtl/>
-        </w:rPr>
-        <w:t xml:space="preserve"> </w:t>
-      </w:r>
-      <m:oMath>
-        <m:r>
-          <m:rPr>
-            <m:sty m:val="p"/>
-            <m:scr m:val="double-struck"/>
-          </m:rPr>
-          <m:t>R</m:t>
-        </m:r>
-      </m:oMath>
-      <w:r>
-        <w:rPr>
-          <w:rtl/>
-        </w:rPr>
-        <w:t xml:space="preserve"> </w:t>
-      </w:r>
-      <w:r>
-        <w:rPr>
-          <w:rtl/>
-        </w:rPr>
-        <w:t xml:space="preserve">بمجال أو حصر.</w:t>
-      </w:r>
-    </w:p>
-    <w:p>
-      <w:pPr>
-        <w:numPr>
-          <w:ilvl w:val="0"/>
-          <w:numId w:val="1019"/>
-        </w:numPr>
-        <w:bidi/>
-      </w:pPr>
-      <w:r>
-        <w:rPr>
-          <w:rtl/>
-        </w:rPr>
-        <w:t xml:space="preserve">تعيين تقاطع واتحاد مجالين.</w:t>
-      </w:r>
-    </w:p>
-    <w:p>
-      <w:pPr>
-        <w:bidi/>
-      </w:pPr>
-      <w:r>
-        <w:rPr>
-          <w:rtl/>
-        </w:rPr>
-        <w:t xml:space="preserve">الكتاب المدرسي ، السبورة.</w:t>
-      </w:r>
-    </w:p>
-    <w:p>
-      <w:pPr>
-        <w:bidi/>
-      </w:pPr>
-      <w:r>
-        <w:rPr>
-          <w:rtl/>
-        </w:rPr>
-        <w:br w:type="page"/>
-      </w:r>
-    </w:p>
-    <w:p>
-      <w:pPr>
-        <w:numPr>
-          <w:ilvl w:val="0"/>
-          <w:numId w:val="1020"/>
-        </w:numPr>
-        <w:bidi/>
-      </w:pPr>
-      <w:r>
-        <w:rPr>
-          <w:rtl/>
-        </w:rPr>
-        <w:t xml:space="preserve">المستقيم العددي والمجالات.</w:t>
-      </w:r>
-    </w:p>
-    <w:p>
-      <w:pPr>
-        <w:numPr>
-          <w:ilvl w:val="0"/>
-          <w:numId w:val="1021"/>
-        </w:numPr>
-        <w:bidi/>
-      </w:pPr>
-      <w:r>
-        <w:rPr>
-          <w:rtl/>
-        </w:rPr>
-        <w:t xml:space="preserve">كتابة عبارة بقيمة مطلقة دون الرمز.</w:t>
-      </w:r>
-    </w:p>
-    <w:p>
-      <w:pPr>
-        <w:numPr>
-          <w:ilvl w:val="0"/>
-          <w:numId w:val="1021"/>
-        </w:numPr>
-        <w:bidi/>
-      </w:pPr>
-      <w:r>
-        <w:rPr>
-          <w:rtl/>
-        </w:rPr>
-        <w:t xml:space="preserve">التعبير عن مجال بأربع صيغ: مجال ، حصر ، مسافة ، قيمة مطلقة.</w:t>
-      </w:r>
-    </w:p>
-    <w:p>
-      <w:pPr>
-        <w:bidi/>
-      </w:pPr>
-      <w:r>
-        <w:rPr>
-          <w:rtl/>
-        </w:rPr>
-        <w:t xml:space="preserve">الكتاب المدرسي (باب «الترتيب في</w:t>
-      </w:r>
-      <w:r>
-        <w:rPr>
-          <w:rtl/>
-        </w:rPr>
-        <w:t xml:space="preserve"> </w:t>
-      </w:r>
-      <m:oMath>
-        <m:r>
-          <m:rPr>
-            <m:sty m:val="p"/>
-            <m:scr m:val="double-struck"/>
-          </m:rPr>
-          <m:t>R</m:t>
-        </m:r>
-      </m:oMath>
-      <w:r>
-        <w:rPr>
-          <w:rtl/>
-        </w:rPr>
-        <w:t xml:space="preserve">»: نشاط 4 المسافة).</w:t>
-      </w:r>
-    </w:p>
-    <w:p>
-      <w:pPr>
-        <w:bidi/>
-      </w:pPr>
-      <w:r>
-        <w:rPr>
-          <w:rtl/>
-        </w:rPr>
-        <w:br w:type="page"/>
-      </w:r>
-    </w:p>
-    <w:p>
-      <w:pPr>
-        <w:numPr>
-          <w:ilvl w:val="0"/>
           <w:numId w:val="1022"/>
         </w:numPr>
         <w:bidi/>
@@ -1737,6 +1647,21 @@
       <w:pPr>
         <w:numPr>
           <w:ilvl w:val="0"/>
+          <w:numId w:val="1022"/>
+        </w:numPr>
+        <w:bidi/>
+      </w:pPr>
+      <w:r>
+        <w:rPr>
+          <w:rtl/>
+        </w:rPr>
+        <w:t xml:space="preserve">حل معادلة ومتراجحة من الدرجة الأولى.</w:t>
+      </w:r>
+    </w:p>
+    <w:p>
+      <w:pPr>
+        <w:numPr>
+          <w:ilvl w:val="0"/>
           <w:numId w:val="1023"/>
         </w:numPr>
         <w:bidi/>
@@ -1765,61 +1690,9 @@
     </w:p>
     <w:p>
       <w:pPr>
-        <w:bidi/>
-      </w:pPr>
-      <w:r>
-        <w:rPr>
-          <w:rtl/>
-        </w:rPr>
-        <w:t xml:space="preserve">الكتاب المدرسي ، السبورة.</w:t>
-      </w:r>
-    </w:p>
-    <w:p>
-      <w:pPr>
-        <w:bidi/>
-      </w:pPr>
-      <w:r>
-        <w:rPr>
-          <w:rtl/>
-        </w:rPr>
-        <w:br w:type="page"/>
-      </w:r>
-    </w:p>
-    <w:p>
-      <w:pPr>
-        <w:numPr>
-          <w:ilvl w:val="0"/>
-          <w:numId w:val="1024"/>
-        </w:numPr>
-        <w:bidi/>
-      </w:pPr>
-      <w:r>
-        <w:rPr>
-          <w:rtl/>
-        </w:rPr>
-        <w:t xml:space="preserve">حل معادلة ومتراجحة من الدرجة الأولى.</w:t>
-      </w:r>
-    </w:p>
-    <w:p>
-      <w:pPr>
-        <w:numPr>
-          <w:ilvl w:val="0"/>
-          <w:numId w:val="1024"/>
-        </w:numPr>
-        <w:bidi/>
-      </w:pPr>
-      <w:r>
-        <w:rPr>
-          <w:rtl/>
-        </w:rPr>
-        <w:t xml:space="preserve">المجالات.</w:t>
-      </w:r>
-    </w:p>
-    <w:p>
-      <w:pPr>
-        <w:numPr>
-          <w:ilvl w:val="0"/>
-          <w:numId w:val="1025"/>
+        <w:numPr>
+          <w:ilvl w:val="0"/>
+          <w:numId w:val="1023"/>
         </w:numPr>
         <w:bidi/>
       </w:pPr>
@@ -1861,28 +1734,13 @@
     </w:p>
     <w:p>
       <w:pPr>
-        <w:numPr>
-          <w:ilvl w:val="0"/>
-          <w:numId w:val="1025"/>
-        </w:numPr>
-        <w:bidi/>
-      </w:pPr>
-      <w:r>
-        <w:rPr>
-          <w:rtl/>
-        </w:rPr>
-        <w:t xml:space="preserve">حل متراجحات من شكل جداء أو حاصل قسمة.</w:t>
-      </w:r>
-    </w:p>
-    <w:p>
-      <w:pPr>
-        <w:bidi/>
-      </w:pPr>
-      <w:r>
-        <w:rPr>
-          <w:rtl/>
-        </w:rPr>
-        <w:t xml:space="preserve">الكتاب المدرسي ، السبورة.</w:t>
+        <w:bidi/>
+      </w:pPr>
+      <w:r>
+        <w:rPr>
+          <w:rtl/>
+        </w:rPr>
+        <w:t xml:space="preserve">المنهاج ، الكتاب المدرسي ، السبورة.</w:t>
       </w:r>
     </w:p>
     <w:sectPr>
@@ -2008,7 +1866,7 @@
         <w:szCs w:val="20"/>
         <w:rtl/>
       </w:rPr>
-      <w:t>المذكرة الشاملة: الأعداد والحساب</w:t>
+      <w:t>مذكرات محور: الأعداد والحساب</w:t>
     </w:r>
     <w:r>
       <w:rPr>
@@ -2368,12 +2226,6 @@
     <w:abstractNumId w:val="991"/>
   </w:num>
   <w:num w:numId="1023">
-    <w:abstractNumId w:val="991"/>
-  </w:num>
-  <w:num w:numId="1024">
-    <w:abstractNumId w:val="991"/>
-  </w:num>
-  <w:num w:numId="1025">
     <w:abstractNumId w:val="991"/>
   </w:num>
 </w:numbering>

</xml_diff>